<commit_message>
Add baseline characteristics shell and builder
</commit_message>
<xml_diff>
--- a/clinical_data_viewer/assets/shells/change_from_baseline_horizontal.docx
+++ b/clinical_data_viewer/assets/shells/change_from_baseline_horizontal.docx
@@ -72,7 +72,7 @@
               <w:end w:w="90" w:type="dxa"/>
             </w:tcMar>
             <w:tcBorders>
-              <w:top w:val="nil"/>
+              <w:top w:val="single" w:sz="8" w:color="000000"/>
               <w:left w:val="nil"/>
               <w:bottom w:val="single" w:sz="8" w:space="0" w:color="000000"/>
               <w:right w:val="nil"/>
@@ -108,7 +108,7 @@
               <w:end w:w="90" w:type="dxa"/>
             </w:tcMar>
             <w:tcBorders>
-              <w:top w:val="nil"/>
+              <w:top w:val="single" w:sz="8" w:color="000000"/>
               <w:left w:val="nil"/>
               <w:bottom w:val="single" w:sz="8" w:space="0" w:color="000000"/>
               <w:right w:val="nil"/>
@@ -144,7 +144,7 @@
               <w:end w:w="90" w:type="dxa"/>
             </w:tcMar>
             <w:tcBorders>
-              <w:top w:val="nil"/>
+              <w:top w:val="single" w:sz="8" w:color="000000"/>
               <w:left w:val="nil"/>
               <w:bottom w:val="single" w:sz="8" w:space="0" w:color="000000"/>
               <w:right w:val="nil"/>
@@ -180,7 +180,7 @@
               <w:end w:w="90" w:type="dxa"/>
             </w:tcMar>
             <w:tcBorders>
-              <w:top w:val="nil"/>
+              <w:top w:val="single" w:sz="8" w:color="000000"/>
               <w:left w:val="nil"/>
               <w:bottom w:val="single" w:sz="8" w:space="0" w:color="000000"/>
               <w:right w:val="nil"/>
@@ -216,7 +216,7 @@
               <w:end w:w="90" w:type="dxa"/>
             </w:tcMar>
             <w:tcBorders>
-              <w:top w:val="nil"/>
+              <w:top w:val="single" w:sz="8" w:color="000000"/>
               <w:left w:val="nil"/>
               <w:bottom w:val="single" w:sz="8" w:space="0" w:color="000000"/>
               <w:right w:val="nil"/>
@@ -252,7 +252,7 @@
               <w:end w:w="90" w:type="dxa"/>
             </w:tcMar>
             <w:tcBorders>
-              <w:top w:val="nil"/>
+              <w:top w:val="single" w:sz="8" w:color="000000"/>
               <w:left w:val="nil"/>
               <w:bottom w:val="single" w:sz="8" w:space="0" w:color="000000"/>
               <w:right w:val="nil"/>
@@ -288,7 +288,7 @@
               <w:end w:w="90" w:type="dxa"/>
             </w:tcMar>
             <w:tcBorders>
-              <w:top w:val="nil"/>
+              <w:top w:val="single" w:sz="8" w:color="000000"/>
               <w:left w:val="nil"/>
               <w:bottom w:val="single" w:sz="8" w:space="0" w:color="000000"/>
               <w:right w:val="nil"/>
@@ -324,7 +324,7 @@
               <w:end w:w="90" w:type="dxa"/>
             </w:tcMar>
             <w:tcBorders>
-              <w:top w:val="nil"/>
+              <w:top w:val="single" w:sz="8" w:color="000000"/>
               <w:left w:val="nil"/>
               <w:bottom w:val="single" w:sz="8" w:space="0" w:color="000000"/>
               <w:right w:val="nil"/>
@@ -360,7 +360,7 @@
               <w:end w:w="90" w:type="dxa"/>
             </w:tcMar>
             <w:tcBorders>
-              <w:top w:val="nil"/>
+              <w:top w:val="single" w:sz="8" w:color="000000"/>
               <w:left w:val="nil"/>
               <w:bottom w:val="single" w:sz="8" w:space="0" w:color="000000"/>
               <w:right w:val="nil"/>
@@ -396,7 +396,7 @@
               <w:end w:w="90" w:type="dxa"/>
             </w:tcMar>
             <w:tcBorders>
-              <w:top w:val="nil"/>
+              <w:top w:val="single" w:sz="8" w:color="000000"/>
               <w:left w:val="nil"/>
               <w:bottom w:val="single" w:sz="8" w:space="0" w:color="000000"/>
               <w:right w:val="nil"/>
@@ -435,7 +435,7 @@
               <w:end w:w="90" w:type="dxa"/>
             </w:tcMar>
             <w:tcBorders>
-              <w:top w:val="nil"/>
+              <w:top w:val="single" w:sz="8" w:space="0" w:color="000000"/>
               <w:left w:val="nil"/>
               <w:bottom w:val="nil"/>
               <w:right w:val="nil"/>
@@ -463,7 +463,7 @@
               <w:end w:w="90" w:type="dxa"/>
             </w:tcMar>
             <w:tcBorders>
-              <w:top w:val="nil"/>
+              <w:top w:val="single" w:sz="8" w:space="0" w:color="000000"/>
               <w:left w:val="nil"/>
               <w:bottom w:val="nil"/>
               <w:right w:val="nil"/>
@@ -499,7 +499,7 @@
               <w:end w:w="90" w:type="dxa"/>
             </w:tcMar>
             <w:tcBorders>
-              <w:top w:val="nil"/>
+              <w:top w:val="single" w:sz="8" w:space="0" w:color="000000"/>
               <w:left w:val="nil"/>
               <w:bottom w:val="nil"/>
               <w:right w:val="nil"/>
@@ -509,18 +509,10 @@
           </w:tcPr>
           <w:p>
             <w:pPr>
-              <w:spacing w:before="0" w:after="0" w:line="240" w:lineRule="auto"/>
               <w:jc w:val="center"/>
             </w:pPr>
-            <w:r/>
             <w:r>
-              <w:rPr>
-                <w:rFonts w:ascii="Arial" w:hAnsi="Arial"/>
-                <w:b w:val="0"/>
-                <w:i w:val="0"/>
-                <w:sz w:val="17"/>
-              </w:rPr>
-              <w:t>[ ]</w:t>
+              <w:t>x</w:t>
             </w:r>
           </w:p>
         </w:tc>
@@ -535,7 +527,7 @@
               <w:end w:w="90" w:type="dxa"/>
             </w:tcMar>
             <w:tcBorders>
-              <w:top w:val="nil"/>
+              <w:top w:val="single" w:sz="8" w:space="0" w:color="000000"/>
               <w:left w:val="nil"/>
               <w:bottom w:val="nil"/>
               <w:right w:val="nil"/>
@@ -545,18 +537,10 @@
           </w:tcPr>
           <w:p>
             <w:pPr>
-              <w:spacing w:before="0" w:after="0" w:line="240" w:lineRule="auto"/>
               <w:jc w:val="center"/>
             </w:pPr>
-            <w:r/>
             <w:r>
-              <w:rPr>
-                <w:rFonts w:ascii="Arial" w:hAnsi="Arial"/>
-                <w:b w:val="0"/>
-                <w:i w:val="0"/>
-                <w:sz w:val="17"/>
-              </w:rPr>
-              <w:t>[ ]</w:t>
+              <w:t>xx.x</w:t>
             </w:r>
           </w:p>
         </w:tc>
@@ -571,7 +555,7 @@
               <w:end w:w="90" w:type="dxa"/>
             </w:tcMar>
             <w:tcBorders>
-              <w:top w:val="nil"/>
+              <w:top w:val="single" w:sz="8" w:space="0" w:color="000000"/>
               <w:left w:val="nil"/>
               <w:bottom w:val="nil"/>
               <w:right w:val="nil"/>
@@ -581,18 +565,10 @@
           </w:tcPr>
           <w:p>
             <w:pPr>
-              <w:spacing w:before="0" w:after="0" w:line="240" w:lineRule="auto"/>
               <w:jc w:val="center"/>
             </w:pPr>
-            <w:r/>
             <w:r>
-              <w:rPr>
-                <w:rFonts w:ascii="Arial" w:hAnsi="Arial"/>
-                <w:b w:val="0"/>
-                <w:i w:val="0"/>
-                <w:sz w:val="17"/>
-              </w:rPr>
-              <w:t>[ ]</w:t>
+              <w:t>xx.xx</w:t>
             </w:r>
           </w:p>
         </w:tc>
@@ -607,7 +583,7 @@
               <w:end w:w="90" w:type="dxa"/>
             </w:tcMar>
             <w:tcBorders>
-              <w:top w:val="nil"/>
+              <w:top w:val="single" w:sz="8" w:space="0" w:color="000000"/>
               <w:left w:val="nil"/>
               <w:bottom w:val="nil"/>
               <w:right w:val="nil"/>
@@ -617,18 +593,10 @@
           </w:tcPr>
           <w:p>
             <w:pPr>
-              <w:spacing w:before="0" w:after="0" w:line="240" w:lineRule="auto"/>
               <w:jc w:val="center"/>
             </w:pPr>
-            <w:r/>
             <w:r>
-              <w:rPr>
-                <w:rFonts w:ascii="Arial" w:hAnsi="Arial"/>
-                <w:b w:val="0"/>
-                <w:i w:val="0"/>
-                <w:sz w:val="17"/>
-              </w:rPr>
-              <w:t>[ ]</w:t>
+              <w:t>xx.x</w:t>
             </w:r>
           </w:p>
         </w:tc>
@@ -643,7 +611,7 @@
               <w:end w:w="90" w:type="dxa"/>
             </w:tcMar>
             <w:tcBorders>
-              <w:top w:val="nil"/>
+              <w:top w:val="single" w:sz="8" w:space="0" w:color="000000"/>
               <w:left w:val="nil"/>
               <w:bottom w:val="nil"/>
               <w:right w:val="nil"/>
@@ -653,18 +621,10 @@
           </w:tcPr>
           <w:p>
             <w:pPr>
-              <w:spacing w:before="0" w:after="0" w:line="240" w:lineRule="auto"/>
               <w:jc w:val="center"/>
             </w:pPr>
-            <w:r/>
             <w:r>
-              <w:rPr>
-                <w:rFonts w:ascii="Arial" w:hAnsi="Arial"/>
-                <w:b w:val="0"/>
-                <w:i w:val="0"/>
-                <w:sz w:val="17"/>
-              </w:rPr>
-              <w:t>[ ]</w:t>
+              <w:t>xx.x</w:t>
             </w:r>
           </w:p>
         </w:tc>
@@ -679,7 +639,7 @@
               <w:end w:w="90" w:type="dxa"/>
             </w:tcMar>
             <w:tcBorders>
-              <w:top w:val="nil"/>
+              <w:top w:val="single" w:sz="8" w:space="0" w:color="000000"/>
               <w:left w:val="nil"/>
               <w:bottom w:val="nil"/>
               <w:right w:val="nil"/>
@@ -689,18 +649,10 @@
           </w:tcPr>
           <w:p>
             <w:pPr>
-              <w:spacing w:before="0" w:after="0" w:line="240" w:lineRule="auto"/>
               <w:jc w:val="center"/>
             </w:pPr>
-            <w:r/>
             <w:r>
-              <w:rPr>
-                <w:rFonts w:ascii="Arial" w:hAnsi="Arial"/>
-                <w:b w:val="0"/>
-                <w:i w:val="0"/>
-                <w:sz w:val="17"/>
-              </w:rPr>
-              <w:t>[ ]</w:t>
+              <w:t>xx.x</w:t>
             </w:r>
           </w:p>
         </w:tc>
@@ -715,7 +667,7 @@
               <w:end w:w="90" w:type="dxa"/>
             </w:tcMar>
             <w:tcBorders>
-              <w:top w:val="nil"/>
+              <w:top w:val="single" w:sz="8" w:space="0" w:color="000000"/>
               <w:left w:val="nil"/>
               <w:bottom w:val="nil"/>
               <w:right w:val="nil"/>
@@ -725,18 +677,10 @@
           </w:tcPr>
           <w:p>
             <w:pPr>
-              <w:spacing w:before="0" w:after="0" w:line="240" w:lineRule="auto"/>
               <w:jc w:val="center"/>
             </w:pPr>
-            <w:r/>
             <w:r>
-              <w:rPr>
-                <w:rFonts w:ascii="Arial" w:hAnsi="Arial"/>
-                <w:b w:val="0"/>
-                <w:i w:val="0"/>
-                <w:sz w:val="17"/>
-              </w:rPr>
-              <w:t>[ ]</w:t>
+              <w:t>xx</w:t>
             </w:r>
           </w:p>
         </w:tc>
@@ -751,7 +695,7 @@
               <w:end w:w="90" w:type="dxa"/>
             </w:tcMar>
             <w:tcBorders>
-              <w:top w:val="nil"/>
+              <w:top w:val="single" w:sz="8" w:space="0" w:color="000000"/>
               <w:left w:val="nil"/>
               <w:bottom w:val="nil"/>
               <w:right w:val="nil"/>
@@ -761,18 +705,10 @@
           </w:tcPr>
           <w:p>
             <w:pPr>
-              <w:spacing w:before="0" w:after="0" w:line="240" w:lineRule="auto"/>
               <w:jc w:val="center"/>
             </w:pPr>
-            <w:r/>
             <w:r>
-              <w:rPr>
-                <w:rFonts w:ascii="Arial" w:hAnsi="Arial"/>
-                <w:b w:val="0"/>
-                <w:i w:val="0"/>
-                <w:sz w:val="17"/>
-              </w:rPr>
-              <w:t>[ ]</w:t>
+              <w:t>xx</w:t>
             </w:r>
           </w:p>
         </w:tc>
@@ -857,18 +793,10 @@
           </w:tcPr>
           <w:p>
             <w:pPr>
-              <w:spacing w:before="0" w:after="0" w:line="240" w:lineRule="auto"/>
               <w:jc w:val="center"/>
             </w:pPr>
-            <w:r/>
             <w:r>
-              <w:rPr>
-                <w:rFonts w:ascii="Arial" w:hAnsi="Arial"/>
-                <w:b w:val="0"/>
-                <w:i w:val="0"/>
-                <w:sz w:val="17"/>
-              </w:rPr>
-              <w:t>[ ]</w:t>
+              <w:t>x</w:t>
             </w:r>
           </w:p>
         </w:tc>
@@ -893,18 +821,10 @@
           </w:tcPr>
           <w:p>
             <w:pPr>
-              <w:spacing w:before="0" w:after="0" w:line="240" w:lineRule="auto"/>
               <w:jc w:val="center"/>
             </w:pPr>
-            <w:r/>
             <w:r>
-              <w:rPr>
-                <w:rFonts w:ascii="Arial" w:hAnsi="Arial"/>
-                <w:b w:val="0"/>
-                <w:i w:val="0"/>
-                <w:sz w:val="17"/>
-              </w:rPr>
-              <w:t>[ ]</w:t>
+              <w:t>xx.x</w:t>
             </w:r>
           </w:p>
         </w:tc>
@@ -929,18 +849,10 @@
           </w:tcPr>
           <w:p>
             <w:pPr>
-              <w:spacing w:before="0" w:after="0" w:line="240" w:lineRule="auto"/>
               <w:jc w:val="center"/>
             </w:pPr>
-            <w:r/>
             <w:r>
-              <w:rPr>
-                <w:rFonts w:ascii="Arial" w:hAnsi="Arial"/>
-                <w:b w:val="0"/>
-                <w:i w:val="0"/>
-                <w:sz w:val="17"/>
-              </w:rPr>
-              <w:t>[ ]</w:t>
+              <w:t>xx.xx</w:t>
             </w:r>
           </w:p>
         </w:tc>
@@ -965,18 +877,10 @@
           </w:tcPr>
           <w:p>
             <w:pPr>
-              <w:spacing w:before="0" w:after="0" w:line="240" w:lineRule="auto"/>
               <w:jc w:val="center"/>
             </w:pPr>
-            <w:r/>
             <w:r>
-              <w:rPr>
-                <w:rFonts w:ascii="Arial" w:hAnsi="Arial"/>
-                <w:b w:val="0"/>
-                <w:i w:val="0"/>
-                <w:sz w:val="17"/>
-              </w:rPr>
-              <w:t>[ ]</w:t>
+              <w:t>xx.x</w:t>
             </w:r>
           </w:p>
         </w:tc>
@@ -1001,18 +905,10 @@
           </w:tcPr>
           <w:p>
             <w:pPr>
-              <w:spacing w:before="0" w:after="0" w:line="240" w:lineRule="auto"/>
               <w:jc w:val="center"/>
             </w:pPr>
-            <w:r/>
             <w:r>
-              <w:rPr>
-                <w:rFonts w:ascii="Arial" w:hAnsi="Arial"/>
-                <w:b w:val="0"/>
-                <w:i w:val="0"/>
-                <w:sz w:val="17"/>
-              </w:rPr>
-              <w:t>[ ]</w:t>
+              <w:t>xx.x</w:t>
             </w:r>
           </w:p>
         </w:tc>
@@ -1037,18 +933,10 @@
           </w:tcPr>
           <w:p>
             <w:pPr>
-              <w:spacing w:before="0" w:after="0" w:line="240" w:lineRule="auto"/>
               <w:jc w:val="center"/>
             </w:pPr>
-            <w:r/>
             <w:r>
-              <w:rPr>
-                <w:rFonts w:ascii="Arial" w:hAnsi="Arial"/>
-                <w:b w:val="0"/>
-                <w:i w:val="0"/>
-                <w:sz w:val="17"/>
-              </w:rPr>
-              <w:t>[ ]</w:t>
+              <w:t>xx.x</w:t>
             </w:r>
           </w:p>
         </w:tc>
@@ -1073,18 +961,10 @@
           </w:tcPr>
           <w:p>
             <w:pPr>
-              <w:spacing w:before="0" w:after="0" w:line="240" w:lineRule="auto"/>
               <w:jc w:val="center"/>
             </w:pPr>
-            <w:r/>
             <w:r>
-              <w:rPr>
-                <w:rFonts w:ascii="Arial" w:hAnsi="Arial"/>
-                <w:b w:val="0"/>
-                <w:i w:val="0"/>
-                <w:sz w:val="17"/>
-              </w:rPr>
-              <w:t>[ ]</w:t>
+              <w:t>xx</w:t>
             </w:r>
           </w:p>
         </w:tc>
@@ -1109,18 +989,10 @@
           </w:tcPr>
           <w:p>
             <w:pPr>
-              <w:spacing w:before="0" w:after="0" w:line="240" w:lineRule="auto"/>
               <w:jc w:val="center"/>
             </w:pPr>
-            <w:r/>
             <w:r>
-              <w:rPr>
-                <w:rFonts w:ascii="Arial" w:hAnsi="Arial"/>
-                <w:b w:val="0"/>
-                <w:i w:val="0"/>
-                <w:sz w:val="17"/>
-              </w:rPr>
-              <w:t>[ ]</w:t>
+              <w:t>xx</w:t>
             </w:r>
           </w:p>
         </w:tc>
@@ -1205,18 +1077,10 @@
           </w:tcPr>
           <w:p>
             <w:pPr>
-              <w:spacing w:before="0" w:after="0" w:line="240" w:lineRule="auto"/>
               <w:jc w:val="center"/>
             </w:pPr>
-            <w:r/>
             <w:r>
-              <w:rPr>
-                <w:rFonts w:ascii="Arial" w:hAnsi="Arial"/>
-                <w:b w:val="0"/>
-                <w:i w:val="0"/>
-                <w:sz w:val="17"/>
-              </w:rPr>
-              <w:t>[ ]</w:t>
+              <w:t>x</w:t>
             </w:r>
           </w:p>
         </w:tc>
@@ -1241,18 +1105,10 @@
           </w:tcPr>
           <w:p>
             <w:pPr>
-              <w:spacing w:before="0" w:after="0" w:line="240" w:lineRule="auto"/>
               <w:jc w:val="center"/>
             </w:pPr>
-            <w:r/>
             <w:r>
-              <w:rPr>
-                <w:rFonts w:ascii="Arial" w:hAnsi="Arial"/>
-                <w:b w:val="0"/>
-                <w:i w:val="0"/>
-                <w:sz w:val="17"/>
-              </w:rPr>
-              <w:t>[ ]</w:t>
+              <w:t>xx.x</w:t>
             </w:r>
           </w:p>
         </w:tc>
@@ -1277,18 +1133,10 @@
           </w:tcPr>
           <w:p>
             <w:pPr>
-              <w:spacing w:before="0" w:after="0" w:line="240" w:lineRule="auto"/>
               <w:jc w:val="center"/>
             </w:pPr>
-            <w:r/>
             <w:r>
-              <w:rPr>
-                <w:rFonts w:ascii="Arial" w:hAnsi="Arial"/>
-                <w:b w:val="0"/>
-                <w:i w:val="0"/>
-                <w:sz w:val="17"/>
-              </w:rPr>
-              <w:t>[ ]</w:t>
+              <w:t>xx.xx</w:t>
             </w:r>
           </w:p>
         </w:tc>
@@ -1313,18 +1161,10 @@
           </w:tcPr>
           <w:p>
             <w:pPr>
-              <w:spacing w:before="0" w:after="0" w:line="240" w:lineRule="auto"/>
               <w:jc w:val="center"/>
             </w:pPr>
-            <w:r/>
             <w:r>
-              <w:rPr>
-                <w:rFonts w:ascii="Arial" w:hAnsi="Arial"/>
-                <w:b w:val="0"/>
-                <w:i w:val="0"/>
-                <w:sz w:val="17"/>
-              </w:rPr>
-              <w:t>[ ]</w:t>
+              <w:t>xx.x</w:t>
             </w:r>
           </w:p>
         </w:tc>
@@ -1349,18 +1189,10 @@
           </w:tcPr>
           <w:p>
             <w:pPr>
-              <w:spacing w:before="0" w:after="0" w:line="240" w:lineRule="auto"/>
               <w:jc w:val="center"/>
             </w:pPr>
-            <w:r/>
             <w:r>
-              <w:rPr>
-                <w:rFonts w:ascii="Arial" w:hAnsi="Arial"/>
-                <w:b w:val="0"/>
-                <w:i w:val="0"/>
-                <w:sz w:val="17"/>
-              </w:rPr>
-              <w:t>[ ]</w:t>
+              <w:t>xx.x</w:t>
             </w:r>
           </w:p>
         </w:tc>
@@ -1385,18 +1217,10 @@
           </w:tcPr>
           <w:p>
             <w:pPr>
-              <w:spacing w:before="0" w:after="0" w:line="240" w:lineRule="auto"/>
               <w:jc w:val="center"/>
             </w:pPr>
-            <w:r/>
             <w:r>
-              <w:rPr>
-                <w:rFonts w:ascii="Arial" w:hAnsi="Arial"/>
-                <w:b w:val="0"/>
-                <w:i w:val="0"/>
-                <w:sz w:val="17"/>
-              </w:rPr>
-              <w:t>[ ]</w:t>
+              <w:t>xx.x</w:t>
             </w:r>
           </w:p>
         </w:tc>
@@ -1421,18 +1245,10 @@
           </w:tcPr>
           <w:p>
             <w:pPr>
-              <w:spacing w:before="0" w:after="0" w:line="240" w:lineRule="auto"/>
               <w:jc w:val="center"/>
             </w:pPr>
-            <w:r/>
             <w:r>
-              <w:rPr>
-                <w:rFonts w:ascii="Arial" w:hAnsi="Arial"/>
-                <w:b w:val="0"/>
-                <w:i w:val="0"/>
-                <w:sz w:val="17"/>
-              </w:rPr>
-              <w:t>[ ]</w:t>
+              <w:t>xx</w:t>
             </w:r>
           </w:p>
         </w:tc>
@@ -1457,18 +1273,10 @@
           </w:tcPr>
           <w:p>
             <w:pPr>
-              <w:spacing w:before="0" w:after="0" w:line="240" w:lineRule="auto"/>
               <w:jc w:val="center"/>
             </w:pPr>
-            <w:r/>
             <w:r>
-              <w:rPr>
-                <w:rFonts w:ascii="Arial" w:hAnsi="Arial"/>
-                <w:b w:val="0"/>
-                <w:i w:val="0"/>
-                <w:sz w:val="17"/>
-              </w:rPr>
-              <w:t>[ ]</w:t>
+              <w:t>xx</w:t>
             </w:r>
           </w:p>
         </w:tc>
@@ -1560,18 +1368,10 @@
           </w:tcPr>
           <w:p>
             <w:pPr>
-              <w:spacing w:before="0" w:after="0" w:line="240" w:lineRule="auto"/>
               <w:jc w:val="center"/>
             </w:pPr>
-            <w:r/>
             <w:r>
-              <w:rPr>
-                <w:rFonts w:ascii="Arial" w:hAnsi="Arial"/>
-                <w:b w:val="0"/>
-                <w:i w:val="0"/>
-                <w:sz w:val="17"/>
-              </w:rPr>
-              <w:t>[ ]</w:t>
+              <w:t>x</w:t>
             </w:r>
           </w:p>
         </w:tc>
@@ -1596,18 +1396,10 @@
           </w:tcPr>
           <w:p>
             <w:pPr>
-              <w:spacing w:before="0" w:after="0" w:line="240" w:lineRule="auto"/>
               <w:jc w:val="center"/>
             </w:pPr>
-            <w:r/>
             <w:r>
-              <w:rPr>
-                <w:rFonts w:ascii="Arial" w:hAnsi="Arial"/>
-                <w:b w:val="0"/>
-                <w:i w:val="0"/>
-                <w:sz w:val="17"/>
-              </w:rPr>
-              <w:t>[ ]</w:t>
+              <w:t>xx.x</w:t>
             </w:r>
           </w:p>
         </w:tc>
@@ -1632,18 +1424,10 @@
           </w:tcPr>
           <w:p>
             <w:pPr>
-              <w:spacing w:before="0" w:after="0" w:line="240" w:lineRule="auto"/>
               <w:jc w:val="center"/>
             </w:pPr>
-            <w:r/>
             <w:r>
-              <w:rPr>
-                <w:rFonts w:ascii="Arial" w:hAnsi="Arial"/>
-                <w:b w:val="0"/>
-                <w:i w:val="0"/>
-                <w:sz w:val="17"/>
-              </w:rPr>
-              <w:t>[ ]</w:t>
+              <w:t>xx.xx</w:t>
             </w:r>
           </w:p>
         </w:tc>
@@ -1668,18 +1452,10 @@
           </w:tcPr>
           <w:p>
             <w:pPr>
-              <w:spacing w:before="0" w:after="0" w:line="240" w:lineRule="auto"/>
               <w:jc w:val="center"/>
             </w:pPr>
-            <w:r/>
             <w:r>
-              <w:rPr>
-                <w:rFonts w:ascii="Arial" w:hAnsi="Arial"/>
-                <w:b w:val="0"/>
-                <w:i w:val="0"/>
-                <w:sz w:val="17"/>
-              </w:rPr>
-              <w:t>[ ]</w:t>
+              <w:t>xx.x</w:t>
             </w:r>
           </w:p>
         </w:tc>
@@ -1704,18 +1480,10 @@
           </w:tcPr>
           <w:p>
             <w:pPr>
-              <w:spacing w:before="0" w:after="0" w:line="240" w:lineRule="auto"/>
               <w:jc w:val="center"/>
             </w:pPr>
-            <w:r/>
             <w:r>
-              <w:rPr>
-                <w:rFonts w:ascii="Arial" w:hAnsi="Arial"/>
-                <w:b w:val="0"/>
-                <w:i w:val="0"/>
-                <w:sz w:val="17"/>
-              </w:rPr>
-              <w:t>[ ]</w:t>
+              <w:t>xx.x</w:t>
             </w:r>
           </w:p>
         </w:tc>
@@ -1740,18 +1508,10 @@
           </w:tcPr>
           <w:p>
             <w:pPr>
-              <w:spacing w:before="0" w:after="0" w:line="240" w:lineRule="auto"/>
               <w:jc w:val="center"/>
             </w:pPr>
-            <w:r/>
             <w:r>
-              <w:rPr>
-                <w:rFonts w:ascii="Arial" w:hAnsi="Arial"/>
-                <w:b w:val="0"/>
-                <w:i w:val="0"/>
-                <w:sz w:val="17"/>
-              </w:rPr>
-              <w:t>[ ]</w:t>
+              <w:t>xx.x</w:t>
             </w:r>
           </w:p>
         </w:tc>
@@ -1776,18 +1536,10 @@
           </w:tcPr>
           <w:p>
             <w:pPr>
-              <w:spacing w:before="0" w:after="0" w:line="240" w:lineRule="auto"/>
               <w:jc w:val="center"/>
             </w:pPr>
-            <w:r/>
             <w:r>
-              <w:rPr>
-                <w:rFonts w:ascii="Arial" w:hAnsi="Arial"/>
-                <w:b w:val="0"/>
-                <w:i w:val="0"/>
-                <w:sz w:val="17"/>
-              </w:rPr>
-              <w:t>[ ]</w:t>
+              <w:t>xx</w:t>
             </w:r>
           </w:p>
         </w:tc>
@@ -1812,18 +1564,10 @@
           </w:tcPr>
           <w:p>
             <w:pPr>
-              <w:spacing w:before="0" w:after="0" w:line="240" w:lineRule="auto"/>
               <w:jc w:val="center"/>
             </w:pPr>
-            <w:r/>
             <w:r>
-              <w:rPr>
-                <w:rFonts w:ascii="Arial" w:hAnsi="Arial"/>
-                <w:b w:val="0"/>
-                <w:i w:val="0"/>
-                <w:sz w:val="17"/>
-              </w:rPr>
-              <w:t>[ ]</w:t>
+              <w:t>xx</w:t>
             </w:r>
           </w:p>
         </w:tc>
@@ -1908,18 +1652,10 @@
           </w:tcPr>
           <w:p>
             <w:pPr>
-              <w:spacing w:before="0" w:after="0" w:line="240" w:lineRule="auto"/>
               <w:jc w:val="center"/>
             </w:pPr>
-            <w:r/>
             <w:r>
-              <w:rPr>
-                <w:rFonts w:ascii="Arial" w:hAnsi="Arial"/>
-                <w:b w:val="0"/>
-                <w:i w:val="0"/>
-                <w:sz w:val="17"/>
-              </w:rPr>
-              <w:t>[ ]</w:t>
+              <w:t>x</w:t>
             </w:r>
           </w:p>
         </w:tc>
@@ -1944,18 +1680,10 @@
           </w:tcPr>
           <w:p>
             <w:pPr>
-              <w:spacing w:before="0" w:after="0" w:line="240" w:lineRule="auto"/>
               <w:jc w:val="center"/>
             </w:pPr>
-            <w:r/>
             <w:r>
-              <w:rPr>
-                <w:rFonts w:ascii="Arial" w:hAnsi="Arial"/>
-                <w:b w:val="0"/>
-                <w:i w:val="0"/>
-                <w:sz w:val="17"/>
-              </w:rPr>
-              <w:t>[ ]</w:t>
+              <w:t>xx.x</w:t>
             </w:r>
           </w:p>
         </w:tc>
@@ -1980,18 +1708,10 @@
           </w:tcPr>
           <w:p>
             <w:pPr>
-              <w:spacing w:before="0" w:after="0" w:line="240" w:lineRule="auto"/>
               <w:jc w:val="center"/>
             </w:pPr>
-            <w:r/>
             <w:r>
-              <w:rPr>
-                <w:rFonts w:ascii="Arial" w:hAnsi="Arial"/>
-                <w:b w:val="0"/>
-                <w:i w:val="0"/>
-                <w:sz w:val="17"/>
-              </w:rPr>
-              <w:t>[ ]</w:t>
+              <w:t>xx.xx</w:t>
             </w:r>
           </w:p>
         </w:tc>
@@ -2016,18 +1736,10 @@
           </w:tcPr>
           <w:p>
             <w:pPr>
-              <w:spacing w:before="0" w:after="0" w:line="240" w:lineRule="auto"/>
               <w:jc w:val="center"/>
             </w:pPr>
-            <w:r/>
             <w:r>
-              <w:rPr>
-                <w:rFonts w:ascii="Arial" w:hAnsi="Arial"/>
-                <w:b w:val="0"/>
-                <w:i w:val="0"/>
-                <w:sz w:val="17"/>
-              </w:rPr>
-              <w:t>[ ]</w:t>
+              <w:t>xx.x</w:t>
             </w:r>
           </w:p>
         </w:tc>
@@ -2052,18 +1764,10 @@
           </w:tcPr>
           <w:p>
             <w:pPr>
-              <w:spacing w:before="0" w:after="0" w:line="240" w:lineRule="auto"/>
               <w:jc w:val="center"/>
             </w:pPr>
-            <w:r/>
             <w:r>
-              <w:rPr>
-                <w:rFonts w:ascii="Arial" w:hAnsi="Arial"/>
-                <w:b w:val="0"/>
-                <w:i w:val="0"/>
-                <w:sz w:val="17"/>
-              </w:rPr>
-              <w:t>[ ]</w:t>
+              <w:t>xx.x</w:t>
             </w:r>
           </w:p>
         </w:tc>
@@ -2088,18 +1792,10 @@
           </w:tcPr>
           <w:p>
             <w:pPr>
-              <w:spacing w:before="0" w:after="0" w:line="240" w:lineRule="auto"/>
               <w:jc w:val="center"/>
             </w:pPr>
-            <w:r/>
             <w:r>
-              <w:rPr>
-                <w:rFonts w:ascii="Arial" w:hAnsi="Arial"/>
-                <w:b w:val="0"/>
-                <w:i w:val="0"/>
-                <w:sz w:val="17"/>
-              </w:rPr>
-              <w:t>[ ]</w:t>
+              <w:t>xx.x</w:t>
             </w:r>
           </w:p>
         </w:tc>
@@ -2124,18 +1820,10 @@
           </w:tcPr>
           <w:p>
             <w:pPr>
-              <w:spacing w:before="0" w:after="0" w:line="240" w:lineRule="auto"/>
               <w:jc w:val="center"/>
             </w:pPr>
-            <w:r/>
             <w:r>
-              <w:rPr>
-                <w:rFonts w:ascii="Arial" w:hAnsi="Arial"/>
-                <w:b w:val="0"/>
-                <w:i w:val="0"/>
-                <w:sz w:val="17"/>
-              </w:rPr>
-              <w:t>[ ]</w:t>
+              <w:t>xx</w:t>
             </w:r>
           </w:p>
         </w:tc>
@@ -2160,18 +1848,10 @@
           </w:tcPr>
           <w:p>
             <w:pPr>
-              <w:spacing w:before="0" w:after="0" w:line="240" w:lineRule="auto"/>
               <w:jc w:val="center"/>
             </w:pPr>
-            <w:r/>
             <w:r>
-              <w:rPr>
-                <w:rFonts w:ascii="Arial" w:hAnsi="Arial"/>
-                <w:b w:val="0"/>
-                <w:i w:val="0"/>
-                <w:sz w:val="17"/>
-              </w:rPr>
-              <w:t>[ ]</w:t>
+              <w:t>xx</w:t>
             </w:r>
           </w:p>
         </w:tc>
@@ -2256,18 +1936,10 @@
           </w:tcPr>
           <w:p>
             <w:pPr>
-              <w:spacing w:before="0" w:after="0" w:line="240" w:lineRule="auto"/>
               <w:jc w:val="center"/>
             </w:pPr>
-            <w:r/>
             <w:r>
-              <w:rPr>
-                <w:rFonts w:ascii="Arial" w:hAnsi="Arial"/>
-                <w:b w:val="0"/>
-                <w:i w:val="0"/>
-                <w:sz w:val="17"/>
-              </w:rPr>
-              <w:t>[ ]</w:t>
+              <w:t>x</w:t>
             </w:r>
           </w:p>
         </w:tc>
@@ -2292,18 +1964,10 @@
           </w:tcPr>
           <w:p>
             <w:pPr>
-              <w:spacing w:before="0" w:after="0" w:line="240" w:lineRule="auto"/>
               <w:jc w:val="center"/>
             </w:pPr>
-            <w:r/>
             <w:r>
-              <w:rPr>
-                <w:rFonts w:ascii="Arial" w:hAnsi="Arial"/>
-                <w:b w:val="0"/>
-                <w:i w:val="0"/>
-                <w:sz w:val="17"/>
-              </w:rPr>
-              <w:t>[ ]</w:t>
+              <w:t>xx.x</w:t>
             </w:r>
           </w:p>
         </w:tc>
@@ -2328,18 +1992,10 @@
           </w:tcPr>
           <w:p>
             <w:pPr>
-              <w:spacing w:before="0" w:after="0" w:line="240" w:lineRule="auto"/>
               <w:jc w:val="center"/>
             </w:pPr>
-            <w:r/>
             <w:r>
-              <w:rPr>
-                <w:rFonts w:ascii="Arial" w:hAnsi="Arial"/>
-                <w:b w:val="0"/>
-                <w:i w:val="0"/>
-                <w:sz w:val="17"/>
-              </w:rPr>
-              <w:t>[ ]</w:t>
+              <w:t>xx.xx</w:t>
             </w:r>
           </w:p>
         </w:tc>
@@ -2364,18 +2020,10 @@
           </w:tcPr>
           <w:p>
             <w:pPr>
-              <w:spacing w:before="0" w:after="0" w:line="240" w:lineRule="auto"/>
               <w:jc w:val="center"/>
             </w:pPr>
-            <w:r/>
             <w:r>
-              <w:rPr>
-                <w:rFonts w:ascii="Arial" w:hAnsi="Arial"/>
-                <w:b w:val="0"/>
-                <w:i w:val="0"/>
-                <w:sz w:val="17"/>
-              </w:rPr>
-              <w:t>[ ]</w:t>
+              <w:t>xx.x</w:t>
             </w:r>
           </w:p>
         </w:tc>
@@ -2400,18 +2048,10 @@
           </w:tcPr>
           <w:p>
             <w:pPr>
-              <w:spacing w:before="0" w:after="0" w:line="240" w:lineRule="auto"/>
               <w:jc w:val="center"/>
             </w:pPr>
-            <w:r/>
             <w:r>
-              <w:rPr>
-                <w:rFonts w:ascii="Arial" w:hAnsi="Arial"/>
-                <w:b w:val="0"/>
-                <w:i w:val="0"/>
-                <w:sz w:val="17"/>
-              </w:rPr>
-              <w:t>[ ]</w:t>
+              <w:t>xx.x</w:t>
             </w:r>
           </w:p>
         </w:tc>
@@ -2436,18 +2076,10 @@
           </w:tcPr>
           <w:p>
             <w:pPr>
-              <w:spacing w:before="0" w:after="0" w:line="240" w:lineRule="auto"/>
               <w:jc w:val="center"/>
             </w:pPr>
-            <w:r/>
             <w:r>
-              <w:rPr>
-                <w:rFonts w:ascii="Arial" w:hAnsi="Arial"/>
-                <w:b w:val="0"/>
-                <w:i w:val="0"/>
-                <w:sz w:val="17"/>
-              </w:rPr>
-              <w:t>[ ]</w:t>
+              <w:t>xx.x</w:t>
             </w:r>
           </w:p>
         </w:tc>
@@ -2472,18 +2104,10 @@
           </w:tcPr>
           <w:p>
             <w:pPr>
-              <w:spacing w:before="0" w:after="0" w:line="240" w:lineRule="auto"/>
               <w:jc w:val="center"/>
             </w:pPr>
-            <w:r/>
             <w:r>
-              <w:rPr>
-                <w:rFonts w:ascii="Arial" w:hAnsi="Arial"/>
-                <w:b w:val="0"/>
-                <w:i w:val="0"/>
-                <w:sz w:val="17"/>
-              </w:rPr>
-              <w:t>[ ]</w:t>
+              <w:t>xx</w:t>
             </w:r>
           </w:p>
         </w:tc>
@@ -2508,18 +2132,10 @@
           </w:tcPr>
           <w:p>
             <w:pPr>
-              <w:spacing w:before="0" w:after="0" w:line="240" w:lineRule="auto"/>
               <w:jc w:val="center"/>
             </w:pPr>
-            <w:r/>
             <w:r>
-              <w:rPr>
-                <w:rFonts w:ascii="Arial" w:hAnsi="Arial"/>
-                <w:b w:val="0"/>
-                <w:i w:val="0"/>
-                <w:sz w:val="17"/>
-              </w:rPr>
-              <w:t>[ ]</w:t>
+              <w:t>xx</w:t>
             </w:r>
           </w:p>
         </w:tc>
@@ -2611,18 +2227,10 @@
           </w:tcPr>
           <w:p>
             <w:pPr>
-              <w:spacing w:before="0" w:after="0" w:line="240" w:lineRule="auto"/>
               <w:jc w:val="center"/>
             </w:pPr>
-            <w:r/>
             <w:r>
-              <w:rPr>
-                <w:rFonts w:ascii="Arial" w:hAnsi="Arial"/>
-                <w:b w:val="0"/>
-                <w:i w:val="0"/>
-                <w:sz w:val="17"/>
-              </w:rPr>
-              <w:t>[ ]</w:t>
+              <w:t>x</w:t>
             </w:r>
           </w:p>
         </w:tc>
@@ -2647,18 +2255,10 @@
           </w:tcPr>
           <w:p>
             <w:pPr>
-              <w:spacing w:before="0" w:after="0" w:line="240" w:lineRule="auto"/>
               <w:jc w:val="center"/>
             </w:pPr>
-            <w:r/>
             <w:r>
-              <w:rPr>
-                <w:rFonts w:ascii="Arial" w:hAnsi="Arial"/>
-                <w:b w:val="0"/>
-                <w:i w:val="0"/>
-                <w:sz w:val="17"/>
-              </w:rPr>
-              <w:t>[ ]</w:t>
+              <w:t>xx.x</w:t>
             </w:r>
           </w:p>
         </w:tc>
@@ -2683,18 +2283,10 @@
           </w:tcPr>
           <w:p>
             <w:pPr>
-              <w:spacing w:before="0" w:after="0" w:line="240" w:lineRule="auto"/>
               <w:jc w:val="center"/>
             </w:pPr>
-            <w:r/>
             <w:r>
-              <w:rPr>
-                <w:rFonts w:ascii="Arial" w:hAnsi="Arial"/>
-                <w:b w:val="0"/>
-                <w:i w:val="0"/>
-                <w:sz w:val="17"/>
-              </w:rPr>
-              <w:t>[ ]</w:t>
+              <w:t>xx.xx</w:t>
             </w:r>
           </w:p>
         </w:tc>
@@ -2719,18 +2311,10 @@
           </w:tcPr>
           <w:p>
             <w:pPr>
-              <w:spacing w:before="0" w:after="0" w:line="240" w:lineRule="auto"/>
               <w:jc w:val="center"/>
             </w:pPr>
-            <w:r/>
             <w:r>
-              <w:rPr>
-                <w:rFonts w:ascii="Arial" w:hAnsi="Arial"/>
-                <w:b w:val="0"/>
-                <w:i w:val="0"/>
-                <w:sz w:val="17"/>
-              </w:rPr>
-              <w:t>[ ]</w:t>
+              <w:t>xx.x</w:t>
             </w:r>
           </w:p>
         </w:tc>
@@ -2755,18 +2339,10 @@
           </w:tcPr>
           <w:p>
             <w:pPr>
-              <w:spacing w:before="0" w:after="0" w:line="240" w:lineRule="auto"/>
               <w:jc w:val="center"/>
             </w:pPr>
-            <w:r/>
             <w:r>
-              <w:rPr>
-                <w:rFonts w:ascii="Arial" w:hAnsi="Arial"/>
-                <w:b w:val="0"/>
-                <w:i w:val="0"/>
-                <w:sz w:val="17"/>
-              </w:rPr>
-              <w:t>[ ]</w:t>
+              <w:t>xx.x</w:t>
             </w:r>
           </w:p>
         </w:tc>
@@ -2791,18 +2367,10 @@
           </w:tcPr>
           <w:p>
             <w:pPr>
-              <w:spacing w:before="0" w:after="0" w:line="240" w:lineRule="auto"/>
               <w:jc w:val="center"/>
             </w:pPr>
-            <w:r/>
             <w:r>
-              <w:rPr>
-                <w:rFonts w:ascii="Arial" w:hAnsi="Arial"/>
-                <w:b w:val="0"/>
-                <w:i w:val="0"/>
-                <w:sz w:val="17"/>
-              </w:rPr>
-              <w:t>[ ]</w:t>
+              <w:t>xx.x</w:t>
             </w:r>
           </w:p>
         </w:tc>
@@ -2827,18 +2395,10 @@
           </w:tcPr>
           <w:p>
             <w:pPr>
-              <w:spacing w:before="0" w:after="0" w:line="240" w:lineRule="auto"/>
               <w:jc w:val="center"/>
             </w:pPr>
-            <w:r/>
             <w:r>
-              <w:rPr>
-                <w:rFonts w:ascii="Arial" w:hAnsi="Arial"/>
-                <w:b w:val="0"/>
-                <w:i w:val="0"/>
-                <w:sz w:val="17"/>
-              </w:rPr>
-              <w:t>[ ]</w:t>
+              <w:t>xx</w:t>
             </w:r>
           </w:p>
         </w:tc>
@@ -2863,18 +2423,10 @@
           </w:tcPr>
           <w:p>
             <w:pPr>
-              <w:spacing w:before="0" w:after="0" w:line="240" w:lineRule="auto"/>
               <w:jc w:val="center"/>
             </w:pPr>
-            <w:r/>
             <w:r>
-              <w:rPr>
-                <w:rFonts w:ascii="Arial" w:hAnsi="Arial"/>
-                <w:b w:val="0"/>
-                <w:i w:val="0"/>
-                <w:sz w:val="17"/>
-              </w:rPr>
-              <w:t>[ ]</w:t>
+              <w:t>xx</w:t>
             </w:r>
           </w:p>
         </w:tc>
@@ -2959,18 +2511,10 @@
           </w:tcPr>
           <w:p>
             <w:pPr>
-              <w:spacing w:before="0" w:after="0" w:line="240" w:lineRule="auto"/>
               <w:jc w:val="center"/>
             </w:pPr>
-            <w:r/>
             <w:r>
-              <w:rPr>
-                <w:rFonts w:ascii="Arial" w:hAnsi="Arial"/>
-                <w:b w:val="0"/>
-                <w:i w:val="0"/>
-                <w:sz w:val="17"/>
-              </w:rPr>
-              <w:t>[ ]</w:t>
+              <w:t>x</w:t>
             </w:r>
           </w:p>
         </w:tc>
@@ -2995,18 +2539,10 @@
           </w:tcPr>
           <w:p>
             <w:pPr>
-              <w:spacing w:before="0" w:after="0" w:line="240" w:lineRule="auto"/>
               <w:jc w:val="center"/>
             </w:pPr>
-            <w:r/>
             <w:r>
-              <w:rPr>
-                <w:rFonts w:ascii="Arial" w:hAnsi="Arial"/>
-                <w:b w:val="0"/>
-                <w:i w:val="0"/>
-                <w:sz w:val="17"/>
-              </w:rPr>
-              <w:t>[ ]</w:t>
+              <w:t>xx.x</w:t>
             </w:r>
           </w:p>
         </w:tc>
@@ -3031,18 +2567,10 @@
           </w:tcPr>
           <w:p>
             <w:pPr>
-              <w:spacing w:before="0" w:after="0" w:line="240" w:lineRule="auto"/>
               <w:jc w:val="center"/>
             </w:pPr>
-            <w:r/>
             <w:r>
-              <w:rPr>
-                <w:rFonts w:ascii="Arial" w:hAnsi="Arial"/>
-                <w:b w:val="0"/>
-                <w:i w:val="0"/>
-                <w:sz w:val="17"/>
-              </w:rPr>
-              <w:t>[ ]</w:t>
+              <w:t>xx.xx</w:t>
             </w:r>
           </w:p>
         </w:tc>
@@ -3067,18 +2595,10 @@
           </w:tcPr>
           <w:p>
             <w:pPr>
-              <w:spacing w:before="0" w:after="0" w:line="240" w:lineRule="auto"/>
               <w:jc w:val="center"/>
             </w:pPr>
-            <w:r/>
             <w:r>
-              <w:rPr>
-                <w:rFonts w:ascii="Arial" w:hAnsi="Arial"/>
-                <w:b w:val="0"/>
-                <w:i w:val="0"/>
-                <w:sz w:val="17"/>
-              </w:rPr>
-              <w:t>[ ]</w:t>
+              <w:t>xx.x</w:t>
             </w:r>
           </w:p>
         </w:tc>
@@ -3103,18 +2623,10 @@
           </w:tcPr>
           <w:p>
             <w:pPr>
-              <w:spacing w:before="0" w:after="0" w:line="240" w:lineRule="auto"/>
               <w:jc w:val="center"/>
             </w:pPr>
-            <w:r/>
             <w:r>
-              <w:rPr>
-                <w:rFonts w:ascii="Arial" w:hAnsi="Arial"/>
-                <w:b w:val="0"/>
-                <w:i w:val="0"/>
-                <w:sz w:val="17"/>
-              </w:rPr>
-              <w:t>[ ]</w:t>
+              <w:t>xx.x</w:t>
             </w:r>
           </w:p>
         </w:tc>
@@ -3139,18 +2651,10 @@
           </w:tcPr>
           <w:p>
             <w:pPr>
-              <w:spacing w:before="0" w:after="0" w:line="240" w:lineRule="auto"/>
               <w:jc w:val="center"/>
             </w:pPr>
-            <w:r/>
             <w:r>
-              <w:rPr>
-                <w:rFonts w:ascii="Arial" w:hAnsi="Arial"/>
-                <w:b w:val="0"/>
-                <w:i w:val="0"/>
-                <w:sz w:val="17"/>
-              </w:rPr>
-              <w:t>[ ]</w:t>
+              <w:t>xx.x</w:t>
             </w:r>
           </w:p>
         </w:tc>
@@ -3175,18 +2679,10 @@
           </w:tcPr>
           <w:p>
             <w:pPr>
-              <w:spacing w:before="0" w:after="0" w:line="240" w:lineRule="auto"/>
               <w:jc w:val="center"/>
             </w:pPr>
-            <w:r/>
             <w:r>
-              <w:rPr>
-                <w:rFonts w:ascii="Arial" w:hAnsi="Arial"/>
-                <w:b w:val="0"/>
-                <w:i w:val="0"/>
-                <w:sz w:val="17"/>
-              </w:rPr>
-              <w:t>[ ]</w:t>
+              <w:t>xx</w:t>
             </w:r>
           </w:p>
         </w:tc>
@@ -3211,18 +2707,10 @@
           </w:tcPr>
           <w:p>
             <w:pPr>
-              <w:spacing w:before="0" w:after="0" w:line="240" w:lineRule="auto"/>
               <w:jc w:val="center"/>
             </w:pPr>
-            <w:r/>
             <w:r>
-              <w:rPr>
-                <w:rFonts w:ascii="Arial" w:hAnsi="Arial"/>
-                <w:b w:val="0"/>
-                <w:i w:val="0"/>
-                <w:sz w:val="17"/>
-              </w:rPr>
-              <w:t>[ ]</w:t>
+              <w:t>xx</w:t>
             </w:r>
           </w:p>
         </w:tc>
@@ -3307,18 +2795,10 @@
           </w:tcPr>
           <w:p>
             <w:pPr>
-              <w:spacing w:before="0" w:after="0" w:line="240" w:lineRule="auto"/>
               <w:jc w:val="center"/>
             </w:pPr>
-            <w:r/>
             <w:r>
-              <w:rPr>
-                <w:rFonts w:ascii="Arial" w:hAnsi="Arial"/>
-                <w:b w:val="0"/>
-                <w:i w:val="0"/>
-                <w:sz w:val="17"/>
-              </w:rPr>
-              <w:t>[ ]</w:t>
+              <w:t>x</w:t>
             </w:r>
           </w:p>
         </w:tc>
@@ -3343,18 +2823,10 @@
           </w:tcPr>
           <w:p>
             <w:pPr>
-              <w:spacing w:before="0" w:after="0" w:line="240" w:lineRule="auto"/>
               <w:jc w:val="center"/>
             </w:pPr>
-            <w:r/>
             <w:r>
-              <w:rPr>
-                <w:rFonts w:ascii="Arial" w:hAnsi="Arial"/>
-                <w:b w:val="0"/>
-                <w:i w:val="0"/>
-                <w:sz w:val="17"/>
-              </w:rPr>
-              <w:t>[ ]</w:t>
+              <w:t>xx.x</w:t>
             </w:r>
           </w:p>
         </w:tc>
@@ -3379,18 +2851,10 @@
           </w:tcPr>
           <w:p>
             <w:pPr>
-              <w:spacing w:before="0" w:after="0" w:line="240" w:lineRule="auto"/>
               <w:jc w:val="center"/>
             </w:pPr>
-            <w:r/>
             <w:r>
-              <w:rPr>
-                <w:rFonts w:ascii="Arial" w:hAnsi="Arial"/>
-                <w:b w:val="0"/>
-                <w:i w:val="0"/>
-                <w:sz w:val="17"/>
-              </w:rPr>
-              <w:t>[ ]</w:t>
+              <w:t>xx.xx</w:t>
             </w:r>
           </w:p>
         </w:tc>
@@ -3415,18 +2879,10 @@
           </w:tcPr>
           <w:p>
             <w:pPr>
-              <w:spacing w:before="0" w:after="0" w:line="240" w:lineRule="auto"/>
               <w:jc w:val="center"/>
             </w:pPr>
-            <w:r/>
             <w:r>
-              <w:rPr>
-                <w:rFonts w:ascii="Arial" w:hAnsi="Arial"/>
-                <w:b w:val="0"/>
-                <w:i w:val="0"/>
-                <w:sz w:val="17"/>
-              </w:rPr>
-              <w:t>[ ]</w:t>
+              <w:t>xx.x</w:t>
             </w:r>
           </w:p>
         </w:tc>
@@ -3451,18 +2907,10 @@
           </w:tcPr>
           <w:p>
             <w:pPr>
-              <w:spacing w:before="0" w:after="0" w:line="240" w:lineRule="auto"/>
               <w:jc w:val="center"/>
             </w:pPr>
-            <w:r/>
             <w:r>
-              <w:rPr>
-                <w:rFonts w:ascii="Arial" w:hAnsi="Arial"/>
-                <w:b w:val="0"/>
-                <w:i w:val="0"/>
-                <w:sz w:val="17"/>
-              </w:rPr>
-              <w:t>[ ]</w:t>
+              <w:t>xx.x</w:t>
             </w:r>
           </w:p>
         </w:tc>
@@ -3487,18 +2935,10 @@
           </w:tcPr>
           <w:p>
             <w:pPr>
-              <w:spacing w:before="0" w:after="0" w:line="240" w:lineRule="auto"/>
               <w:jc w:val="center"/>
             </w:pPr>
-            <w:r/>
             <w:r>
-              <w:rPr>
-                <w:rFonts w:ascii="Arial" w:hAnsi="Arial"/>
-                <w:b w:val="0"/>
-                <w:i w:val="0"/>
-                <w:sz w:val="17"/>
-              </w:rPr>
-              <w:t>[ ]</w:t>
+              <w:t>xx.x</w:t>
             </w:r>
           </w:p>
         </w:tc>
@@ -3523,18 +2963,10 @@
           </w:tcPr>
           <w:p>
             <w:pPr>
-              <w:spacing w:before="0" w:after="0" w:line="240" w:lineRule="auto"/>
               <w:jc w:val="center"/>
             </w:pPr>
-            <w:r/>
             <w:r>
-              <w:rPr>
-                <w:rFonts w:ascii="Arial" w:hAnsi="Arial"/>
-                <w:b w:val="0"/>
-                <w:i w:val="0"/>
-                <w:sz w:val="17"/>
-              </w:rPr>
-              <w:t>[ ]</w:t>
+              <w:t>xx</w:t>
             </w:r>
           </w:p>
         </w:tc>
@@ -3559,18 +2991,10 @@
           </w:tcPr>
           <w:p>
             <w:pPr>
-              <w:spacing w:before="0" w:after="0" w:line="240" w:lineRule="auto"/>
               <w:jc w:val="center"/>
             </w:pPr>
-            <w:r/>
             <w:r>
-              <w:rPr>
-                <w:rFonts w:ascii="Arial" w:hAnsi="Arial"/>
-                <w:b w:val="0"/>
-                <w:i w:val="0"/>
-                <w:sz w:val="17"/>
-              </w:rPr>
-              <w:t>[ ]</w:t>
+              <w:t>xx</w:t>
             </w:r>
           </w:p>
         </w:tc>
@@ -3578,8 +3002,8 @@
     </w:tbl>
     <w:sectPr>
       <w:footerReference w:type="default" r:id="rId9"/>
-      <w:pgSz w:w="15840" w:h="12240" w:orient="landscape"/>
-      <w:pgMar w:top="648" w:right="691" w:bottom="605" w:left="691" w:header="720" w:footer="720" w:gutter="0"/>
+      <w:pgSz w:w="15840" w:h="7920" w:orient="landscape"/>
+      <w:pgMar w:top="403" w:right="691" w:bottom="173" w:left="691" w:header="720" w:footer="720" w:gutter="0"/>
       <w:cols w:space="720"/>
       <w:docGrid w:linePitch="360"/>
     </w:sectPr>
@@ -3595,16 +3019,7 @@
       <w:spacing w:before="0"/>
       <w:jc w:val="right"/>
     </w:pPr>
-    <w:r>
-      <w:rPr>
-        <w:rFonts w:ascii="Arial" w:hAnsi="Arial"/>
-        <w:b w:val="0"/>
-        <w:i w:val="0"/>
-        <w:color w:val="657786"/>
-        <w:sz w:val="15"/>
-      </w:rPr>
-      <w:t>Page 1 of 1</w:t>
-    </w:r>
+    <w:r/>
   </w:p>
 </w:ftr>
 </file>

</xml_diff>